<commit_message>
adiciona migration para atualizar email do superusuario de teste e atualiza documentacao
</commit_message>
<xml_diff>
--- a/docs/Documentação Técnica - Recuperação de senha.docx
+++ b/docs/Documentação Técnica - Recuperação de senha.docx
@@ -538,7 +538,7 @@
           <w:rFonts w:ascii="Times" w:cs="Times" w:eastAsia="Times" w:hAnsi="Times"/>
           <w:rtl w:val="0"/>
         </w:rPr>
-        <w:t xml:space="preserve">Existem duas formas de verificar se a recuperação de senha está funcionando: uma automatizada (recomendada, mais rápida e sem dependências externas) e uma manual (visual, mostra recebimento do e-mail).</w:t>
+        <w:t xml:space="preserve">Foi criada duas formas de verificar se a recuperação de senha está funcionando: uma automatizada (recomendada, mais rápida e sem dependências externas) e uma manual (visual, mostra recebimento do e-mail).</w:t>
       </w:r>
     </w:p>
     <w:p>
@@ -583,9 +583,9 @@
           <w:rFonts w:ascii="Times" w:cs="Times" w:eastAsia="Times" w:hAnsi="Times"/>
           <w:rtl w:val="0"/>
         </w:rPr>
-        <w:t xml:space="preserve">Para conter o teste com o envio para Gmail, foi desenvolvida a lógica utilizando o SMTP</w:t>
+        <w:t xml:space="preserve">Para realizar o teste com o envio para Gmail, foi desenvolvida a lógica utilizando o SMTP</w:t>
         <w:br w:type="textWrapping"/>
-        <w:t xml:space="preserve">Para que possa realizar o teste, necessita dos próximos passo:</w:t>
+        <w:t xml:space="preserve">Para que possa realizar o teste, foi criada uma conta de Gmail pessoal, dedicada apenas para teste. O acesso à conta será enviado pelo campo de atividade junto com o arquivo .env. Para realizar os teste via Gmail, siga o passos: </w:t>
       </w:r>
     </w:p>
     <w:p>
@@ -690,7 +690,7 @@
           <w:rFonts w:ascii="Times" w:cs="Times" w:eastAsia="Times" w:hAnsi="Times"/>
           <w:rtl w:val="0"/>
         </w:rPr>
-        <w:t xml:space="preserve">Utilizar somente um e-mail já cadastrado de um usuário do banco (é necessário usar um e-mail real)</w:t>
+        <w:t xml:space="preserve">Utilizar o e-mail já cadastrado no usuário (Professor.Teste): conta Gmail professorteste.portalpi@gmail.com</w:t>
       </w:r>
     </w:p>
     <w:p>
@@ -1002,12 +1002,12 @@
           <wp:inline distB="114300" distT="114300" distL="114300" distR="114300">
             <wp:extent cx="5390550" cy="1337191"/>
             <wp:effectExtent b="0" l="0" r="0" t="0"/>
-            <wp:docPr id="5" name="image5.png"/>
+            <wp:docPr id="5" name="image3.png"/>
             <a:graphic>
               <a:graphicData uri="http://schemas.openxmlformats.org/drawingml/2006/picture">
                 <pic:pic>
                   <pic:nvPicPr>
-                    <pic:cNvPr id="0" name="image5.png"/>
+                    <pic:cNvPr id="0" name="image3.png"/>
                     <pic:cNvPicPr preferRelativeResize="0"/>
                   </pic:nvPicPr>
                   <pic:blipFill>
@@ -1842,12 +1842,12 @@
           <wp:inline distB="114300" distT="114300" distL="114300" distR="114300">
             <wp:extent cx="5731200" cy="2489200"/>
             <wp:effectExtent b="0" l="0" r="0" t="0"/>
-            <wp:docPr id="7" name="image1.png"/>
+            <wp:docPr id="7" name="image7.png"/>
             <a:graphic>
               <a:graphicData uri="http://schemas.openxmlformats.org/drawingml/2006/picture">
                 <pic:pic>
                   <pic:nvPicPr>
-                    <pic:cNvPr id="0" name="image1.png"/>
+                    <pic:cNvPr id="0" name="image7.png"/>
                     <pic:cNvPicPr preferRelativeResize="0"/>
                   </pic:nvPicPr>
                   <pic:blipFill>
@@ -1888,12 +1888,12 @@
           <wp:inline distB="114300" distT="114300" distL="114300" distR="114300">
             <wp:extent cx="5731200" cy="2425700"/>
             <wp:effectExtent b="0" l="0" r="0" t="0"/>
-            <wp:docPr id="6" name="image3.png"/>
+            <wp:docPr id="6" name="image1.png"/>
             <a:graphic>
               <a:graphicData uri="http://schemas.openxmlformats.org/drawingml/2006/picture">
                 <pic:pic>
                   <pic:nvPicPr>
-                    <pic:cNvPr id="0" name="image3.png"/>
+                    <pic:cNvPr id="0" name="image1.png"/>
                     <pic:cNvPicPr preferRelativeResize="0"/>
                   </pic:nvPicPr>
                   <pic:blipFill>
@@ -1945,12 +1945,12 @@
           <wp:inline distB="114300" distT="114300" distL="114300" distR="114300">
             <wp:extent cx="5731200" cy="3987800"/>
             <wp:effectExtent b="0" l="0" r="0" t="0"/>
-            <wp:docPr id="1" name="image6.png"/>
+            <wp:docPr id="1" name="image5.png"/>
             <a:graphic>
               <a:graphicData uri="http://schemas.openxmlformats.org/drawingml/2006/picture">
                 <pic:pic>
                   <pic:nvPicPr>
-                    <pic:cNvPr id="0" name="image6.png"/>
+                    <pic:cNvPr id="0" name="image5.png"/>
                     <pic:cNvPicPr preferRelativeResize="0"/>
                   </pic:nvPicPr>
                   <pic:blipFill>
@@ -1991,12 +1991,12 @@
           <wp:inline distB="114300" distT="114300" distL="114300" distR="114300">
             <wp:extent cx="5731200" cy="2463800"/>
             <wp:effectExtent b="0" l="0" r="0" t="0"/>
-            <wp:docPr id="4" name="image7.png"/>
+            <wp:docPr id="4" name="image6.png"/>
             <a:graphic>
               <a:graphicData uri="http://schemas.openxmlformats.org/drawingml/2006/picture">
                 <pic:pic>
                   <pic:nvPicPr>
-                    <pic:cNvPr id="0" name="image7.png"/>
+                    <pic:cNvPr id="0" name="image6.png"/>
                     <pic:cNvPicPr preferRelativeResize="0"/>
                   </pic:nvPicPr>
                   <pic:blipFill>

</xml_diff>